<commit_message>
feat: retag — replace all 8 DOCX masters with original templates + {tag} markers
Copy 8 original DOCX files from templates/ into templates/docx/ as new masters,
replacing dotted/literal placeholders with {tag} markers via scripts/retag.py.
Adds UID_JABAR.docx as a standalone master (previously shared BAI.docx).
Fixes NODIN perihal cell (column 1→2), multi-run set_run_idx guard removal,
and BAI sig-cell paragraph auto-append.

Original files kept in templates/ as reference.

Co-Authored-By: Claude Sonnet 4.6 <noreply@anthropic.com>
</commit_message>
<xml_diff>
--- a/templates/docx/BAST.docx
+++ b/templates/docx/BAST.docx
@@ -31,12 +31,11 @@
       <w:r>
         <w:rPr>
           <w:rFonts w:ascii="Arial" w:cs="Arial" w:eastAsia="Arial" w:hAnsi="Arial"/>
-          <w:b/>
-          <w:sz w:val="20"/>
-          <w:szCs w:val="20"/>
-          <w:rtl w:val="0"/>
-        </w:rPr>
-        <w:t>Pada hari ini, {hari} tanggal {tanggal} bulan {bulan} tahun {tahun}, kami yang bertanda tangan dibawah ini:</w:t>
+          <w:sz w:val="20"/>
+          <w:szCs w:val="20"/>
+          <w:rtl w:val="0"/>
+        </w:rPr>
+        <w:t xml:space="preserve">Pada hari ini,</w:t>
       </w:r>
       <w:r>
         <w:rPr>
@@ -47,14 +46,16 @@
           <w:szCs w:val="20"/>
           <w:rtl w:val="0"/>
         </w:rPr>
-      </w:r>
-      <w:r>
-        <w:rPr>
-          <w:rFonts w:ascii="Arial" w:cs="Arial" w:eastAsia="Arial" w:hAnsi="Arial"/>
-          <w:sz w:val="20"/>
-          <w:szCs w:val="20"/>
-          <w:rtl w:val="0"/>
-        </w:rPr>
+        <w:t xml:space="preserve"> {hari} </w:t>
+      </w:r>
+      <w:r>
+        <w:rPr>
+          <w:rFonts w:ascii="Arial" w:cs="Arial" w:eastAsia="Arial" w:hAnsi="Arial"/>
+          <w:sz w:val="20"/>
+          <w:szCs w:val="20"/>
+          <w:rtl w:val="0"/>
+        </w:rPr>
+        <w:t xml:space="preserve">tanggal </w:t>
       </w:r>
       <w:r>
         <w:rPr>
@@ -65,14 +66,16 @@
           <w:szCs w:val="20"/>
           <w:rtl w:val="0"/>
         </w:rPr>
-      </w:r>
-      <w:r>
-        <w:rPr>
-          <w:rFonts w:ascii="Arial" w:cs="Arial" w:eastAsia="Arial" w:hAnsi="Arial"/>
-          <w:sz w:val="20"/>
-          <w:szCs w:val="20"/>
-          <w:rtl w:val="0"/>
-        </w:rPr>
+        <w:t xml:space="preserve">{tanggal} </w:t>
+      </w:r>
+      <w:r>
+        <w:rPr>
+          <w:rFonts w:ascii="Arial" w:cs="Arial" w:eastAsia="Arial" w:hAnsi="Arial"/>
+          <w:sz w:val="20"/>
+          <w:szCs w:val="20"/>
+          <w:rtl w:val="0"/>
+        </w:rPr>
+        <w:t xml:space="preserve">bulan </w:t>
       </w:r>
       <w:r>
         <w:rPr>
@@ -83,14 +86,16 @@
           <w:szCs w:val="20"/>
           <w:rtl w:val="0"/>
         </w:rPr>
-      </w:r>
-      <w:r>
-        <w:rPr>
-          <w:rFonts w:ascii="Arial" w:cs="Arial" w:eastAsia="Arial" w:hAnsi="Arial"/>
-          <w:sz w:val="20"/>
-          <w:szCs w:val="20"/>
-          <w:rtl w:val="0"/>
-        </w:rPr>
+        <w:t xml:space="preserve">{bulan} </w:t>
+      </w:r>
+      <w:r>
+        <w:rPr>
+          <w:rFonts w:ascii="Arial" w:cs="Arial" w:eastAsia="Arial" w:hAnsi="Arial"/>
+          <w:sz w:val="20"/>
+          <w:szCs w:val="20"/>
+          <w:rtl w:val="0"/>
+        </w:rPr>
+        <w:t xml:space="preserve">tahun </w:t>
       </w:r>
       <w:r>
         <w:rPr>
@@ -101,14 +106,16 @@
           <w:szCs w:val="20"/>
           <w:rtl w:val="0"/>
         </w:rPr>
-      </w:r>
-      <w:r>
-        <w:rPr>
-          <w:rFonts w:ascii="Arial" w:cs="Arial" w:eastAsia="Arial" w:hAnsi="Arial"/>
-          <w:sz w:val="20"/>
-          <w:szCs w:val="20"/>
-          <w:rtl w:val="0"/>
-        </w:rPr>
+        <w:t>{tahun}</w:t>
+      </w:r>
+      <w:r>
+        <w:rPr>
+          <w:rFonts w:ascii="Arial" w:cs="Arial" w:eastAsia="Arial" w:hAnsi="Arial"/>
+          <w:sz w:val="20"/>
+          <w:szCs w:val="20"/>
+          <w:rtl w:val="0"/>
+        </w:rPr>
+        <w:t xml:space="preserve">, kami yang bertanda tangan dibawah ini:</w:t>
       </w:r>
     </w:p>
     <w:p>
@@ -511,6 +518,7 @@
               <w:rPr>
                 <w:rtl w:val="0"/>
               </w:rPr>
+              <w:t xml:space="preserve">………………………….</w:t>
             </w:r>
           </w:p>
         </w:tc>
@@ -1399,7 +1407,7 @@
               <w:rPr>
                 <w:rtl w:val="0"/>
               </w:rPr>
-              <w:t xml:space="preserve">:</w:t>
+              <w:t>: {perangkat}</w:t>
             </w:r>
           </w:p>
         </w:tc>
@@ -1422,9 +1430,6 @@
               <w:rPr>
                 <w:rtl w:val="0"/>
               </w:rPr>
-            </w:r>
-            <w:r>
-              <w:t>{perangkat}</w:t>
             </w:r>
           </w:p>
         </w:tc>
@@ -1486,7 +1491,7 @@
               <w:rPr>
                 <w:rtl w:val="0"/>
               </w:rPr>
-              <w:t xml:space="preserve">:</w:t>
+              <w:t>: {jumlah}</w:t>
             </w:r>
           </w:p>
         </w:tc>
@@ -1509,9 +1514,6 @@
               <w:rPr>
                 <w:rtl w:val="0"/>
               </w:rPr>
-            </w:r>
-            <w:r>
-              <w:t>{jumlah}</w:t>
             </w:r>
           </w:p>
         </w:tc>
@@ -1831,12 +1833,82 @@
             </w:r>
           </w:p>
           <w:p>
-            <w:r>
-              <w:rPr>
-                <w:b/>
+            <w:pPr>
+              <w:jc w:val="center"/>
+              <w:rPr>
+                <w:b w:val="1"/>
+                <w:bCs w:val="1"/>
+              </w:rPr>
+            </w:pPr>
+            <w:r>
+              <w:rPr>
+                <w:rtl w:val="0"/>
+              </w:rPr>
+            </w:r>
+          </w:p>
+          <w:p>
+            <w:pPr>
+              <w:jc w:val="center"/>
+              <w:rPr>
+                <w:b w:val="1"/>
+                <w:bCs w:val="1"/>
+              </w:rPr>
+            </w:pPr>
+            <w:r>
+              <w:rPr>
+                <w:rtl w:val="0"/>
+              </w:rPr>
+            </w:r>
+          </w:p>
+          <w:p>
+            <w:pPr>
+              <w:jc w:val="center"/>
+              <w:rPr>
+                <w:b w:val="1"/>
+                <w:bCs w:val="1"/>
+              </w:rPr>
+            </w:pPr>
+            <w:r>
+              <w:rPr>
+                <w:rtl w:val="0"/>
+              </w:rPr>
+            </w:r>
+          </w:p>
+          <w:p>
+            <w:pPr>
+              <w:rPr>
+                <w:b w:val="1"/>
+                <w:bCs w:val="1"/>
+              </w:rPr>
+            </w:pPr>
+            <w:r>
+              <w:rPr>
+                <w:rtl w:val="0"/>
+              </w:rPr>
+            </w:r>
+          </w:p>
+          <w:p>
+            <w:pPr>
+              <w:jc w:val="center"/>
+              <w:rPr>
                 <w:u w:val="single"/>
               </w:rPr>
-              <w:t>( {namaPihakPertama} )</w:t>
+            </w:pPr>
+            <w:r>
+              <w:rPr>
+                <w:rtl w:val="0"/>
+              </w:rPr>
+            </w:r>
+          </w:p>
+          <w:p>
+            <w:pPr>
+              <w:jc w:val="center"/>
+              <w:rPr/>
+            </w:pPr>
+            <w:r>
+              <w:rPr>
+                <w:rtl w:val="0"/>
+              </w:rPr>
             </w:r>
           </w:p>
         </w:tc>
@@ -1887,8 +1959,6 @@
               <w:rPr>
                 <w:rtl w:val="0"/>
               </w:rPr>
-            </w:r>
-            <w:r>
               <w:t>{%ttd}</w:t>
             </w:r>
           </w:p>
@@ -1904,23 +1974,63 @@
               <w:rPr>
                 <w:rtl w:val="0"/>
               </w:rPr>
-            </w:r>
-            <w:r>
               <w:t>{%stempel}</w:t>
             </w:r>
           </w:p>
           <w:p>
-            <w:r>
-              <w:rPr>
-                <w:b/>
-                <w:u w:val="single"/>
-              </w:rPr>
-              <w:t>( {namaPihakKedua} )</w:t>
-            </w:r>
-          </w:p>
-          <w:p>
-            <w:r>
-              <w:t>{jabatanPihakKedua}</w:t>
+            <w:pPr>
+              <w:jc w:val="center"/>
+              <w:rPr>
+                <w:b w:val="1"/>
+                <w:bCs w:val="1"/>
+              </w:rPr>
+            </w:pPr>
+            <w:r>
+              <w:rPr>
+                <w:rtl w:val="0"/>
+              </w:rPr>
+            </w:r>
+          </w:p>
+          <w:p>
+            <w:pPr>
+              <w:jc w:val="center"/>
+              <w:rPr>
+                <w:b w:val="1"/>
+                <w:bCs w:val="1"/>
+              </w:rPr>
+            </w:pPr>
+            <w:r>
+              <w:rPr>
+                <w:rtl w:val="0"/>
+              </w:rPr>
+            </w:r>
+          </w:p>
+          <w:p>
+            <w:pPr>
+              <w:jc w:val="center"/>
+              <w:rPr>
+                <w:b w:val="1"/>
+                <w:bCs w:val="1"/>
+              </w:rPr>
+            </w:pPr>
+            <w:r>
+              <w:rPr>
+                <w:rtl w:val="0"/>
+              </w:rPr>
+            </w:r>
+          </w:p>
+          <w:p>
+            <w:pPr>
+              <w:jc w:val="center"/>
+              <w:rPr>
+                <w:b w:val="1"/>
+                <w:bCs w:val="1"/>
+              </w:rPr>
+            </w:pPr>
+            <w:r>
+              <w:rPr>
+                <w:rtl w:val="0"/>
+              </w:rPr>
             </w:r>
           </w:p>
         </w:tc>
@@ -1957,19 +2067,9 @@
                 <w:u w:val="single"/>
                 <w:rtl w:val="0"/>
               </w:rPr>
-            </w:r>
-          </w:p>
-        </w:tc>
-        <w:tc>
-          <w:tcPr>
-            <w:tcBorders>
-              <w:top w:color="000000" w:space="0" w:sz="0" w:val="nil"/>
-              <w:left w:color="000000" w:space="0" w:sz="0" w:val="nil"/>
-              <w:bottom w:color="000000" w:space="0" w:sz="0" w:val="nil"/>
-              <w:right w:color="000000" w:space="0" w:sz="0" w:val="nil"/>
-            </w:tcBorders>
-            <w:shd w:fill="auto" w:val="clear"/>
-          </w:tcPr>
+              <w:t>{namaPihakPertama}</w:t>
+            </w:r>
+          </w:p>
           <w:p>
             <w:pPr>
               <w:jc w:val="center"/>
@@ -1985,16 +2085,6 @@
               </w:rPr>
             </w:r>
           </w:p>
-        </w:tc>
-        <w:tc>
-          <w:tcPr>
-            <w:tcBorders>
-              <w:top w:color="000000" w:space="0" w:sz="0" w:val="nil"/>
-              <w:left w:color="000000" w:space="0" w:sz="0" w:val="nil"/>
-              <w:bottom w:color="000000" w:space="0" w:sz="0" w:val="nil"/>
-              <w:right w:color="000000" w:space="0" w:sz="0" w:val="nil"/>
-            </w:tcBorders>
-          </w:tcPr>
           <w:p>
             <w:pPr>
               <w:jc w:val="center"/>
@@ -2006,9 +2096,118 @@
             </w:pPr>
             <w:r>
               <w:rPr>
+                <w:rtl w:val="0"/>
+              </w:rPr>
+            </w:r>
+          </w:p>
+        </w:tc>
+        <w:tc>
+          <w:tcPr>
+            <w:tcBorders>
+              <w:top w:color="000000" w:space="0" w:sz="0" w:val="nil"/>
+              <w:left w:color="000000" w:space="0" w:sz="0" w:val="nil"/>
+              <w:bottom w:color="000000" w:space="0" w:sz="0" w:val="nil"/>
+              <w:right w:color="000000" w:space="0" w:sz="0" w:val="nil"/>
+            </w:tcBorders>
+            <w:shd w:fill="auto" w:val="clear"/>
+          </w:tcPr>
+          <w:p>
+            <w:pPr>
+              <w:jc w:val="center"/>
+              <w:rPr>
                 <w:b w:val="1"/>
                 <w:bCs w:val="1"/>
                 <w:u w:val="single"/>
+              </w:rPr>
+            </w:pPr>
+            <w:r>
+              <w:rPr>
+                <w:rtl w:val="0"/>
+              </w:rPr>
+            </w:r>
+          </w:p>
+        </w:tc>
+        <w:tc>
+          <w:tcPr>
+            <w:tcBorders>
+              <w:top w:color="000000" w:space="0" w:sz="0" w:val="nil"/>
+              <w:left w:color="000000" w:space="0" w:sz="0" w:val="nil"/>
+              <w:bottom w:color="000000" w:space="0" w:sz="0" w:val="nil"/>
+              <w:right w:color="000000" w:space="0" w:sz="0" w:val="nil"/>
+            </w:tcBorders>
+          </w:tcPr>
+          <w:p>
+            <w:pPr>
+              <w:jc w:val="center"/>
+              <w:rPr>
+                <w:b w:val="1"/>
+                <w:bCs w:val="1"/>
+                <w:u w:val="single"/>
+              </w:rPr>
+            </w:pPr>
+            <w:r>
+              <w:rPr>
+                <w:b w:val="1"/>
+                <w:bCs w:val="1"/>
+                <w:u w:val="single"/>
+                <w:rtl w:val="0"/>
+              </w:rPr>
+              <w:t>{namaPihakKedua}</w:t>
+            </w:r>
+          </w:p>
+          <w:p>
+            <w:pPr>
+              <w:jc w:val="center"/>
+              <w:rPr>
+                <w:b w:val="1"/>
+                <w:bCs w:val="1"/>
+                <w:u w:val="single"/>
+              </w:rPr>
+            </w:pPr>
+            <w:r>
+              <w:rPr>
+                <w:rtl w:val="0"/>
+              </w:rPr>
+            </w:r>
+          </w:p>
+          <w:p>
+            <w:pPr>
+              <w:jc w:val="center"/>
+              <w:rPr>
+                <w:b w:val="1"/>
+                <w:bCs w:val="1"/>
+              </w:rPr>
+            </w:pPr>
+            <w:r>
+              <w:rPr>
+                <w:rtl w:val="0"/>
+              </w:rPr>
+            </w:r>
+          </w:p>
+          <w:p>
+            <w:pPr>
+              <w:jc w:val="center"/>
+              <w:rPr>
+                <w:b w:val="1"/>
+                <w:bCs w:val="1"/>
+              </w:rPr>
+            </w:pPr>
+            <w:r>
+              <w:rPr>
+                <w:rtl w:val="0"/>
+              </w:rPr>
+            </w:r>
+          </w:p>
+          <w:p>
+            <w:pPr>
+              <w:jc w:val="center"/>
+              <w:rPr>
+                <w:b w:val="1"/>
+                <w:bCs w:val="1"/>
+              </w:rPr>
+            </w:pPr>
+            <w:r>
+              <w:rPr>
                 <w:rtl w:val="0"/>
               </w:rPr>
             </w:r>
@@ -2239,7 +2438,7 @@
         <w:bCs w:val="1"/>
         <w:rtl w:val="0"/>
       </w:rPr>
-      <w:t>Nomor : {nomor}</w:t>
+      <w:t xml:space="preserve">Nomor : </w:t>
     </w:r>
     <w:r>
       <w:rPr>
@@ -2250,6 +2449,7 @@
         <w:szCs w:val="20"/>
         <w:rtl w:val="0"/>
       </w:rPr>
+      <w:t>{nomor}</w:t>
     </w:r>
   </w:p>
   <w:p>

</xml_diff>

<commit_message>
feat(BAST): repeatable Perangkat/Jumlah rows, fix broken table layout
Master had a 4-col table with one Perangkat + one Jumlah row; the narrow
value cell wrapped 'Jumlah' char-per-line. Replace with a docxtemplater
{#items}...{/items} paragraph loop so a BAST can list many devices.

- fix_bast_perangkat.py: drop the table, emit 3-para loop (Perangkat /
  Jumlah / lone {/items}); {/items} alone keeps paragraphLoop mode, group
  gap via Jumlah space-after. Colon at 2160 tab, indent 567 under item 1.
- templates.ts: BAST 'items' repeat group (perangkat, jumlah); drop flat
  perangkat/jumlah fields; suggestName now keys off nomor.
- Generic +/- repeat UI in EditorModal picks it up automatically.

Co-Authored-By: Claude Opus 4.8 <noreply@anthropic.com>
</commit_message>
<xml_diff>
--- a/templates/docx/BAST.docx
+++ b/templates/docx/BAST.docx
@@ -1319,181 +1319,96 @@
         </w:rPr>
       </w:r>
     </w:p>
-    <w:tbl>
-      <w:tblPr>
-        <w:tblStyle w:val="Table2"/>
-        <w:tblW w:w="9662.0" w:type="dxa"/>
-        <w:jc w:val="left"/>
-        <w:tblInd w:w="445.0" w:type="dxa"/>
-        <w:tblBorders>
-          <w:top w:color="000000" w:space="0" w:sz="4" w:val="single"/>
-          <w:left w:color="000000" w:space="0" w:sz="4" w:val="single"/>
-          <w:bottom w:color="000000" w:space="0" w:sz="4" w:val="single"/>
-          <w:right w:color="000000" w:space="0" w:sz="4" w:val="single"/>
-          <w:insideH w:color="000000" w:space="0" w:sz="4" w:val="single"/>
-          <w:insideV w:color="000000" w:space="0" w:sz="4" w:val="single"/>
-        </w:tblBorders>
-        <w:tblLayout w:type="fixed"/>
-        <w:tblLook w:val="0400"/>
-      </w:tblPr>
-      <w:tblGrid>
-        <w:gridCol w:w="1960"/>
-        <w:gridCol w:w="425"/>
-        <w:gridCol w:w="7277"/>
-        <w:tblGridChange w:id="0">
-          <w:tblGrid>
-            <w:gridCol w:w="1960"/>
-            <w:gridCol w:w="425"/>
-            <w:gridCol w:w="7277"/>
-          </w:tblGrid>
-        </w:tblGridChange>
-      </w:tblGrid>
-      <w:tr>
-        <w:trPr>
-          <w:cantSplit w:val="0"/>
-          <w:trHeight w:val="192" w:hRule="atLeast"/>
-          <w:tblHeader w:val="0"/>
-        </w:trPr>
-        <w:tc>
-          <w:tcPr>
-            <w:tcBorders>
-              <w:top w:color="000000" w:space="0" w:sz="0" w:val="nil"/>
-              <w:left w:color="000000" w:space="0" w:sz="0" w:val="nil"/>
-              <w:bottom w:color="000000" w:space="0" w:sz="0" w:val="nil"/>
-              <w:right w:color="000000" w:space="0" w:sz="0" w:val="nil"/>
-            </w:tcBorders>
-            <w:shd w:fill="auto" w:val="clear"/>
-          </w:tcPr>
-          <w:p>
-            <w:pPr>
-              <w:tabs>
-                <w:tab w:val="left" w:leader="none" w:pos="540"/>
-                <w:tab w:val="left" w:leader="none" w:pos="3150"/>
-                <w:tab w:val="left" w:leader="none" w:pos="3330"/>
-              </w:tabs>
-              <w:jc w:val="both"/>
-              <w:rPr/>
-            </w:pPr>
-            <w:r>
-              <w:rPr>
-                <w:rtl w:val="0"/>
-              </w:rPr>
-              <w:t xml:space="preserve">Perangkat</w:t>
-            </w:r>
-          </w:p>
-        </w:tc>
-        <w:tc>
-          <w:tcPr>
-            <w:tcBorders>
-              <w:top w:color="000000" w:space="0" w:sz="0" w:val="nil"/>
-              <w:left w:color="000000" w:space="0" w:sz="0" w:val="nil"/>
-              <w:bottom w:color="000000" w:space="0" w:sz="0" w:val="nil"/>
-              <w:right w:color="000000" w:space="0" w:sz="0" w:val="nil"/>
-            </w:tcBorders>
-            <w:shd w:fill="auto" w:val="clear"/>
-          </w:tcPr>
-          <w:p>
-            <w:pPr>
-              <w:tabs>
-                <w:tab w:val="left" w:leader="none" w:pos="540"/>
-                <w:tab w:val="left" w:leader="none" w:pos="3150"/>
-                <w:tab w:val="left" w:leader="none" w:pos="3330"/>
-              </w:tabs>
-              <w:jc w:val="center"/>
-              <w:rPr/>
-            </w:pPr>
-            <w:r>
-              <w:rPr>
-                <w:rtl w:val="0"/>
-              </w:rPr>
-              <w:t>: {perangkat}</w:t>
-            </w:r>
-          </w:p>
-        </w:tc>
-        <w:tc>
-          <w:tcPr>
-            <w:tcBorders>
-              <w:top w:color="000000" w:space="0" w:sz="0" w:val="nil"/>
-              <w:left w:color="000000" w:space="0" w:sz="0" w:val="nil"/>
-              <w:bottom w:color="000000" w:space="0" w:sz="0" w:val="nil"/>
-              <w:right w:color="000000" w:space="0" w:sz="0" w:val="nil"/>
-            </w:tcBorders>
-            <w:shd w:fill="auto" w:val="clear"/>
-          </w:tcPr>
-          <w:p>
-            <w:pPr>
-              <w:tabs>
-                <w:tab w:val="left" w:leader="none" w:pos="540"/>
-                <w:tab w:val="left" w:leader="none" w:pos="3150"/>
-                <w:tab w:val="left" w:leader="none" w:pos="3330"/>
-              </w:tabs>
-              <w:jc w:val="both"/>
-              <w:rPr/>
-            </w:pPr>
-            <w:r>
-              <w:rPr>
-                <w:rtl w:val="0"/>
-              </w:rPr>
-            </w:r>
-          </w:p>
-        </w:tc>
-        <w:tc>
-          <w:tcPr>
-            <w:tcBorders>
-              <w:top w:color="000000" w:space="0" w:sz="0" w:val="nil"/>
-              <w:left w:color="000000" w:space="0" w:sz="0" w:val="nil"/>
-              <w:bottom w:color="000000" w:space="0" w:sz="0" w:val="nil"/>
-              <w:right w:color="000000" w:space="0" w:sz="0" w:val="nil"/>
-            </w:tcBorders>
-            <w:shd w:fill="auto" w:val="clear"/>
-          </w:tcPr>
-          <w:p>
-            <w:pPr>
-              <w:tabs>
-                <w:tab w:val="left" w:leader="none" w:pos="540"/>
-                <w:tab w:val="left" w:leader="none" w:pos="3150"/>
-                <w:tab w:val="left" w:leader="none" w:pos="3330"/>
-              </w:tabs>
-              <w:jc w:val="center"/>
-              <w:rPr/>
-            </w:pPr>
-            <w:r>
-              <w:rPr>
-                <w:rtl w:val="0"/>
-              </w:rPr>
-            </w:r>
-          </w:p>
-        </w:tc>
-      </w:tr>
-      <w:tr>
-        <w:tc>
-          <w:tcPr>
-            <w:tcW w:type="dxa" w:w="1960"/>
-          </w:tcPr>
-          <w:p>
-            <w:r>
-              <w:t>Jumlah</w:t>
-            </w:r>
-          </w:p>
-        </w:tc>
-        <w:tc>
-          <w:tcPr>
-            <w:tcW w:type="dxa" w:w="425"/>
-          </w:tcPr>
-          <w:p>
-            <w:r>
-              <w:t>: {jumlah}</w:t>
-            </w:r>
-          </w:p>
-        </w:tc>
-        <w:tc>
-          <w:tcPr>
-            <w:tcW w:type="dxa" w:w="7277"/>
-          </w:tcPr>
-          <w:p/>
-        </w:tc>
-      </w:tr>
-    </w:tbl>
+    <w:p>
+      <w:pPr>
+        <w:tabs>
+          <w:tab w:val="left" w:pos="2160"/>
+        </w:tabs>
+        <w:spacing w:after="0" w:line="240" w:lineRule="auto"/>
+        <w:ind w:left="567"/>
+      </w:pPr>
+      <w:r>
+        <w:rPr>
+          <w:rFonts w:ascii="Arial" w:cs="Arial" w:eastAsia="Arial" w:hAnsi="Arial"/>
+          <w:sz w:val="20"/>
+          <w:szCs w:val="20"/>
+          <w:rtl w:val="0"/>
+        </w:rPr>
+        <w:t xml:space="preserve">{#items}Perangkat</w:t>
+      </w:r>
+      <w:r>
+        <w:rPr>
+          <w:rFonts w:ascii="Arial" w:cs="Arial" w:eastAsia="Arial" w:hAnsi="Arial"/>
+          <w:sz w:val="20"/>
+          <w:szCs w:val="20"/>
+          <w:rtl w:val="0"/>
+        </w:rPr>
+        <w:tab/>
+      </w:r>
+      <w:r>
+        <w:rPr>
+          <w:rFonts w:ascii="Arial" w:cs="Arial" w:eastAsia="Arial" w:hAnsi="Arial"/>
+          <w:sz w:val="20"/>
+          <w:szCs w:val="20"/>
+          <w:rtl w:val="0"/>
+        </w:rPr>
+        <w:t xml:space="preserve">: {perangkat}</w:t>
+      </w:r>
+    </w:p>
+    <w:p>
+      <w:pPr>
+        <w:tabs>
+          <w:tab w:val="left" w:pos="2160"/>
+        </w:tabs>
+        <w:spacing w:after="160" w:line="240" w:lineRule="auto"/>
+        <w:ind w:left="567"/>
+      </w:pPr>
+      <w:r>
+        <w:rPr>
+          <w:rFonts w:ascii="Arial" w:cs="Arial" w:eastAsia="Arial" w:hAnsi="Arial"/>
+          <w:sz w:val="20"/>
+          <w:szCs w:val="20"/>
+          <w:rtl w:val="0"/>
+        </w:rPr>
+        <w:t xml:space="preserve">Jumlah</w:t>
+      </w:r>
+      <w:r>
+        <w:rPr>
+          <w:rFonts w:ascii="Arial" w:cs="Arial" w:eastAsia="Arial" w:hAnsi="Arial"/>
+          <w:sz w:val="20"/>
+          <w:szCs w:val="20"/>
+          <w:rtl w:val="0"/>
+        </w:rPr>
+        <w:tab/>
+      </w:r>
+      <w:r>
+        <w:rPr>
+          <w:rFonts w:ascii="Arial" w:cs="Arial" w:eastAsia="Arial" w:hAnsi="Arial"/>
+          <w:sz w:val="20"/>
+          <w:szCs w:val="20"/>
+          <w:rtl w:val="0"/>
+        </w:rPr>
+        <w:t xml:space="preserve">: {jumlah}</w:t>
+      </w:r>
+    </w:p>
+    <w:p>
+      <w:pPr>
+        <w:tabs>
+          <w:tab w:val="left" w:pos="2160"/>
+        </w:tabs>
+        <w:spacing w:after="0" w:line="240" w:lineRule="auto"/>
+        <w:ind w:left="567"/>
+      </w:pPr>
+      <w:r>
+        <w:rPr>
+          <w:rFonts w:ascii="Arial" w:cs="Arial" w:eastAsia="Arial" w:hAnsi="Arial"/>
+          <w:sz w:val="20"/>
+          <w:szCs w:val="20"/>
+          <w:rtl w:val="0"/>
+        </w:rPr>
+        <w:t xml:space="preserve">{/items}</w:t>
+      </w:r>
+    </w:p>
     <w:p>
       <w:pPr>
         <w:tabs>

</xml_diff>

<commit_message>
fix: rebuild BAST.docx from both signature and spec-line fixes
The template blob carried two forks' work at once, so neither committed it.
Both scripts are idempotent and both now report "sudah rapi" against this file,
so it is exactly the union of:

- scripts/rapikan_bast_halaman.py (810ffbf): one paragraph per signature cell
  with {%ttd} and {%stempel} side by side, mark row 900 twips.
- scripts/rapikan_bast_alamat_perangkat.py (ae19d78): party cells left-aligned
  (jc=both down to 15 occurrences), keepNext/keepLines on the device lines.

Verified: signature table row heights 200/900/60 atLeast, each mark cell one
paragraph "{%ttd2} {%stempel2}" / "{%ttd} {%stempel}", keepNext 7 keepLines 2.
Rendered with 9 devices — the pair that lands on page two stays together, marks
sit side by side with the names directly beneath. Image rebuilt; the template
hash inside the container matches the one on disk.

Co-Authored-By: Claude Opus 5 <noreply@anthropic.com>
</commit_message>
<xml_diff>
--- a/templates/docx/BAST.docx
+++ b/templates/docx/BAST.docx
@@ -222,7 +222,6 @@
           </w:tcPr>
           <w:p>
             <w:pPr>
-              <w:jc w:val="both"/>
               <w:rPr/>
             </w:pPr>
             <w:r>
@@ -234,7 +233,6 @@
           </w:p>
           <w:p>
             <w:pPr>
-              <w:jc w:val="both"/>
               <w:rPr/>
             </w:pPr>
             <w:r>
@@ -292,7 +290,6 @@
           </w:tcPr>
           <w:p>
             <w:pPr>
-              <w:jc w:val="both"/>
               <w:rPr/>
             </w:pPr>
             <w:r>
@@ -304,7 +301,6 @@
           </w:p>
           <w:p>
             <w:pPr>
-              <w:jc w:val="both"/>
               <w:rPr/>
             </w:pPr>
             <w:r>
@@ -355,7 +351,6 @@
           </w:tcPr>
           <w:p>
             <w:pPr>
-              <w:jc w:val="both"/>
               <w:rPr/>
             </w:pPr>
             <w:r>
@@ -401,7 +396,6 @@
           </w:tcPr>
           <w:p>
             <w:pPr>
-              <w:jc w:val="both"/>
               <w:rPr/>
             </w:pPr>
             <w:r>
@@ -453,7 +447,6 @@
           </w:tcPr>
           <w:p>
             <w:pPr>
-              <w:jc w:val="both"/>
               <w:rPr/>
             </w:pPr>
             <w:r>
@@ -499,7 +492,6 @@
           </w:tcPr>
           <w:p>
             <w:pPr>
-              <w:jc w:val="both"/>
               <w:rPr/>
             </w:pPr>
             <w:r>
@@ -511,7 +503,6 @@
           </w:p>
           <w:p>
             <w:pPr>
-              <w:jc w:val="both"/>
               <w:rPr/>
             </w:pPr>
             <w:r>
@@ -562,7 +553,6 @@
           </w:tcPr>
           <w:p>
             <w:pPr>
-              <w:jc w:val="both"/>
               <w:rPr/>
             </w:pPr>
             <w:r>
@@ -608,7 +598,6 @@
           </w:tcPr>
           <w:p>
             <w:pPr>
-              <w:jc w:val="both"/>
               <w:rPr>
                 <w:b w:val="1"/>
                 <w:bCs w:val="1"/>
@@ -664,7 +653,6 @@
           </w:tcPr>
           <w:p>
             <w:pPr>
-              <w:jc w:val="both"/>
               <w:rPr/>
             </w:pPr>
             <w:r>
@@ -708,7 +696,6 @@
           </w:tcPr>
           <w:p>
             <w:pPr>
-              <w:jc w:val="both"/>
               <w:rPr/>
             </w:pPr>
             <w:r>
@@ -759,7 +746,6 @@
           </w:tcPr>
           <w:p>
             <w:pPr>
-              <w:jc w:val="both"/>
               <w:rPr/>
             </w:pPr>
             <w:r>
@@ -805,7 +791,6 @@
           </w:tcPr>
           <w:p>
             <w:pPr>
-              <w:jc w:val="both"/>
               <w:rPr/>
             </w:pPr>
             <w:r>
@@ -856,7 +841,6 @@
           </w:tcPr>
           <w:p>
             <w:pPr>
-              <w:jc w:val="both"/>
               <w:rPr/>
             </w:pPr>
             <w:r>
@@ -902,7 +886,6 @@
           </w:tcPr>
           <w:p>
             <w:pPr>
-              <w:jc w:val="both"/>
               <w:rPr/>
             </w:pPr>
             <w:r>
@@ -953,7 +936,6 @@
           </w:tcPr>
           <w:p>
             <w:pPr>
-              <w:jc w:val="both"/>
               <w:rPr/>
             </w:pPr>
             <w:r>
@@ -999,7 +981,6 @@
           </w:tcPr>
           <w:p>
             <w:pPr>
-              <w:jc w:val="both"/>
               <w:rPr/>
             </w:pPr>
             <w:r>
@@ -1051,7 +1032,6 @@
           </w:tcPr>
           <w:p>
             <w:pPr>
-              <w:jc w:val="both"/>
               <w:rPr/>
             </w:pPr>
             <w:r>
@@ -1097,7 +1077,6 @@
           </w:tcPr>
           <w:p>
             <w:pPr>
-              <w:jc w:val="both"/>
               <w:rPr/>
             </w:pPr>
             <w:r>
@@ -1148,7 +1127,6 @@
           </w:tcPr>
           <w:p>
             <w:pPr>
-              <w:jc w:val="both"/>
               <w:rPr/>
             </w:pPr>
             <w:r>
@@ -1194,7 +1172,6 @@
           </w:tcPr>
           <w:p>
             <w:pPr>
-              <w:jc w:val="both"/>
               <w:rPr>
                 <w:b w:val="1"/>
                 <w:bCs w:val="1"/>
@@ -1339,6 +1316,8 @@
     </w:p>
     <w:p>
       <w:pPr>
+        <w:keepNext/>
+        <w:keepLines/>
         <w:tabs>
           <w:tab w:val="left" w:pos="2160"/>
           <w:tab w:val="left" w:pos="2340"/>
@@ -1394,6 +1373,7 @@
     </w:p>
     <w:p>
       <w:pPr>
+        <w:keepLines/>
         <w:tabs>
           <w:tab w:val="left" w:pos="2160"/>
           <w:tab w:val="left" w:pos="2340"/>
@@ -1720,7 +1700,7 @@
       <w:tr>
         <w:trPr>
           <w:cantSplit w:val="0"/>
-          <w:trHeight w:val="1200" w:hRule="atLeast"/>
+          <w:trHeight w:val="900" w:hRule="atLeast"/>
           <w:tblHeader w:val="0"/>
         </w:trPr>
         <w:tc>
@@ -1748,16 +1728,12 @@
               </w:rPr>
               <w:t>{%ttd2}</w:t>
             </w:r>
-          </w:p>
-          <w:p>
-            <w:pPr>
-              <w:keepNext w:val="1"/>
-              <w:jc w:val="center"/>
-              <w:rPr>
-                <w:b w:val="1"/>
-                <w:bCs w:val="1"/>
-              </w:rPr>
-            </w:pPr>
+            <w:r>
+              <w:rPr>
+                <w:rtl w:val="0"/>
+              </w:rPr>
+              <w:t xml:space="preserve"> </w:t>
+            </w:r>
             <w:r>
               <w:rPr>
                 <w:rtl w:val="0"/>
@@ -1817,16 +1793,12 @@
               </w:rPr>
               <w:t>{%ttd}</w:t>
             </w:r>
-          </w:p>
-          <w:p>
-            <w:pPr>
-              <w:keepNext w:val="1"/>
-              <w:jc w:val="center"/>
-              <w:rPr>
-                <w:b w:val="1"/>
-                <w:bCs w:val="1"/>
-              </w:rPr>
-            </w:pPr>
+            <w:r>
+              <w:rPr>
+                <w:rtl w:val="0"/>
+              </w:rPr>
+              <w:t xml:space="preserve"> </w:t>
+            </w:r>
             <w:r>
               <w:rPr>
                 <w:rtl w:val="0"/>

</xml_diff>